<commit_message>
canvas-aedesalert y ajuste del guion de validación regional
</commit_message>
<xml_diff>
--- a/milestones/validacion-regional-aedesalert/entregables/Guion_Presentacion_AedesAlert_Cali.docx
+++ b/milestones/validacion-regional-aedesalert/entregables/Guion_Presentacion_AedesAlert_Cali.docx
@@ -102,7 +102,7 @@
         <w:rPr>
           <w:b w:val="0"/>
         </w:rPr>
-        <w:t>Exposición de 5 minutos con 8 diapositivas, más una de respaldo (R) que no cuenta en el tiempo. Cada bloque trae el rango de tiempo de la escaleta, el texto para decir en voz alta y lo que se ve en pantalla. El ritmo de referencia es de unas 130 palabras por minuto. Las cifras en pantalla pueden ser más que las que se dicen: no hace falta leerlas todas.</w:t>
+        <w:t>Exposición de unos 8 minutos con 8 diapositivas, más una de respaldo (R) que no cuenta en el tiempo. Cada bloque trae el rango de tiempo de la escaleta, el texto para decir en voz alta y lo que se ve en pantalla. El ritmo de referencia es de unas 130 palabras por minuto. Las cifras en pantalla pueden ser más que las que se dicen: no hace falta leerlas todas.</w:t>
       </w:r>
     </w:p>
     <w:p>
@@ -127,7 +127,7 @@
         <w:rPr>
           <w:b w:val="0"/>
         </w:rPr>
-        <w:t>0:00–0:15 (15 s) · 34 palabras</w:t>
+        <w:t>0:00–0:20 (20 s) · 45 palabras</w:t>
       </w:r>
     </w:p>
     <w:p>
@@ -139,7 +139,7 @@
         <w:rPr>
           <w:b w:val="0"/>
         </w:rPr>
-        <w:t>Hola a todos. Soy Juan Diego Nieto y les presento AedesAlert Cali. Hoy la evalúo con los cuatro criterios de validación regional del curso: sector económico, impacto, políticas de fomento y apoyo del ecosistema.</w:t>
+        <w:t>Hola a todos. Soy Juan Diego Nieto y les presento AedesAlert Cali, una herramienta de inteligencia artificial para anticipar el riesgo de dengue. Hoy la evalúo con los cuatro criterios de validación regional del curso: sector económico, impacto, políticas de fomento y apoyo del ecosistema.</w:t>
       </w:r>
     </w:p>
     <w:p>
@@ -178,7 +178,7 @@
         <w:rPr>
           <w:b w:val="0"/>
         </w:rPr>
-        <w:t>0:15–0:55 (40 s) · 91 palabras</w:t>
+        <w:t>0:20–1:30 (70 s) · 147 palabras</w:t>
       </w:r>
     </w:p>
     <w:p>
@@ -190,7 +190,7 @@
         <w:rPr>
           <w:b w:val="0"/>
         </w:rPr>
-        <w:t>Empiezo por lo que ya existe: desde mayo de 2026, la Secretaría de Salud Pública de Cali usa DengueIA, hecho con Icesi, Univalle y la Fundación Rockefeller. Anticipa el riesgo hasta con tres semanas, con un 93 % de efectividad reportada. Eso prueba que anticipar funciona.</w:t>
+        <w:t>Empiezo por algo que encontré al investigar: desde mayo de 2026, la Secretaría de Salud Pública de Cali usa DengueIA, una herramienta hecha con Icesi, Univalle y la Fundación Rockefeller. Anticipa el riesgo hasta con tres semanas, con un 93 % de efectividad reportada. Eso no le quita sentido a mi idea; al contrario, prueba que anticipar el dengue con datos funciona.</w:t>
       </w:r>
     </w:p>
     <w:p>
@@ -202,7 +202,7 @@
         <w:rPr>
           <w:b w:val="0"/>
         </w:rPr>
-        <w:t>AedesAlert lo complementa: cruza los casos con datos de clima y muestra cada semana un mapa semáforo por comuna, con datos abiertos y código libre. Lo pruebo con las 22 comunas de Cali, para llevarlo a los otros ocho municipios del Valle en riesgo muy alto.</w:t>
+        <w:t>AedesAlert lo complementa. Cruza los casos de dengue que se reportan al SIVIGILA, el sistema nacional de vigilancia, con datos de lluvia, temperatura y humedad de NASA POWER. Compara modelos de aprendizaje automático con un modelo estadístico clásico como referencia. El resultado es un mapa semáforo por comuna que se actualiza cada semana. La diferencia es que todo es abierto: datos abiertos y código libre. Lo pruebo con las 22 comunas de Cali para llevarlo a los otros ocho municipios del Valle en riesgo muy alto.</w:t>
       </w:r>
     </w:p>
     <w:p>
@@ -241,7 +241,7 @@
         <w:rPr>
           <w:b w:val="0"/>
         </w:rPr>
-        <w:t>0:55–1:35 (40 s) · 81 palabras</w:t>
+        <w:t>1:30–2:45 (75 s) · 166 palabras</w:t>
       </w:r>
     </w:p>
     <w:p>
@@ -253,7 +253,7 @@
         <w:rPr>
           <w:b w:val="0"/>
         </w:rPr>
-        <w:t>Primer criterio: caracterización económica. AedesAlert transforma el sector salud, en su segmento HealthTech, la tecnología aplicada a la salud, con capacidades del sector de tecnología.</w:t>
+        <w:t>Primer criterio: caracterización económica. AedesAlert transforma el sector salud, en su segmento HealthTech, es decir, tecnología aplicada a la salud, y lo hace con capacidades del sector de tecnología.</w:t>
       </w:r>
     </w:p>
     <w:p>
@@ -265,7 +265,19 @@
         <w:rPr>
           <w:b w:val="0"/>
         </w:rPr>
-        <w:t>El Valle es la tercera economía del país, con cerca del 9,8 % del producto interno bruto, según cifras preliminares de 2025. El Clúster de Excelencia Clínica de Cali reunía 528 empresas en 2023. Y el empleo en tecnología del Valle creció en promedio 7,2 % entre 2019 y 2023, frente a 4,9 % en el país. Puntaje: 5.</w:t>
+        <w:t>¿Por qué importa? El Valle es la tercera economía del país, con cerca del 9,8 % del producto interno bruto, según cifras preliminares de 2025. El Clúster de Excelencia Clínica de la Cámara de Comercio de Cali reunía 528 empresas en 2023, y una de sus líneas es justamente «Modelos de negocio HealthTech», que la Cámara priorizó en 2025. Además, la Cámara midió que las instituciones de salud de la región tienen una madurez digital intermedia: 2,42 sobre 5. Ahí hay una brecha que esta idea ayuda a cerrar. Y el talento existe: el empleo en tecnología del Valle creció en promedio 7,2 % entre 2019 y 2023, frente a 4,9 % en el país.</w:t>
+      </w:r>
+    </w:p>
+    <w:p>
+      <w:pPr>
+        <w:keepNext/>
+        <w:keepLines/>
+      </w:pPr>
+      <w:r>
+        <w:rPr>
+          <w:b w:val="0"/>
+        </w:rPr>
+        <w:t>Como el clúster se enfoca en clínicas privadas, mi vínculo pasa por esa línea HealthTech y por usuarios como IPS, EPS y laboratorios. Puntaje: 5.</w:t>
       </w:r>
     </w:p>
     <w:p>
@@ -304,7 +316,7 @@
         <w:rPr>
           <w:b w:val="0"/>
         </w:rPr>
-        <w:t>1:35–2:25 (50 s) · 97 palabras</w:t>
+        <w:t>2:45–4:10 (85 s) · 175 palabras</w:t>
       </w:r>
     </w:p>
     <w:p>
@@ -316,7 +328,7 @@
         <w:rPr>
           <w:b w:val="0"/>
         </w:rPr>
-        <w:t>Segundo criterio: impacto social o técnico. El problema es grande y está medido. En 2024, Cali tuvo 1.520 casos de dengue por cada 100.000 habitantes; el país, 937. Ese año, con más de 20.000 casos, Cali declaró emergencia sanitaria. Y Cali y otros ocho municipios del Valle están en riesgo muy alto. En Colombia, el dengue cuesta unos 252 millones de dólares al año, en dólares de 2020.</w:t>
+        <w:t>Segundo criterio: impacto social o técnico. El problema es grande y está medido. El dengue es endémico en el Valle, con brotes cada dos a cuatro años. En 2024, Cali tuvo 1.520 casos por cada 100.000 habitantes, cuando en el país fueron 937. Ese año, con más de 20.000 casos, la ciudad declaró emergencia sanitaria. El Plan Territorial de Salud ubica a Cali y a otros ocho municipios en riesgo muy alto. En Colombia, el dengue cuesta unos 252 millones de dólares al año, en dólares de 2020.</w:t>
       </w:r>
     </w:p>
     <w:p>
@@ -328,7 +340,7 @@
         <w:rPr>
           <w:b w:val="0"/>
         </w:rPr>
-        <w:t>Anticipar es posible: en Cali, el clima de dos a cinco semanas antes mejora la predicción. Le doy 4 y no 5, porque DengueIA ya resolvió parte de esto.</w:t>
+        <w:t>En lo técnico, anticipar es posible. Un estudio en Cali encontró que el clima de dos a cinco semanas antes mejora la predicción, y otro en Colombia mostró que un Random Forest con casos y clima rezagados supera a un modelo ARIMA. Por eso redefino el cuello de botella: en Cali ya se anticipa, pero esa capacidad no está disponible como herramienta abierta y replicable para los demás municipios. Le doy 4 y no 5, porque mi aporte es complementario y la demanda todavía no está validada.</w:t>
       </w:r>
     </w:p>
     <w:p>
@@ -367,7 +379,7 @@
         <w:rPr>
           <w:b w:val="0"/>
         </w:rPr>
-        <w:t>2:25–3:05 (40 s) · 79 palabras</w:t>
+        <w:t>4:10–5:10 (60 s) · 130 palabras</w:t>
       </w:r>
     </w:p>
     <w:p>
@@ -379,7 +391,7 @@
         <w:rPr>
           <w:b w:val="0"/>
         </w:rPr>
-        <w:t>Tercer criterio: políticas de fomento. La idea está alineada en los tres niveles.</w:t>
+        <w:t>Tercer criterio: políticas de fomento. La idea está alineada en los tres niveles de gobierno.</w:t>
       </w:r>
     </w:p>
     <w:p>
@@ -391,7 +403,31 @@
         <w:rPr>
           <w:b w:val="0"/>
         </w:rPr>
-        <w:t>En lo nacional, con el CONPES 4144 de 2025, la Política Nacional de Inteligencia Artificial, y con el Plan Decenal de Salud Pública. En lo departamental, con el Plan de Desarrollo «Liderazgo que Transforma» y con el Plan Territorial de Salud, que propone usar inteligencia artificial y análisis de datos. En lo distrital, Cali prioriza el dengue y ya usa inteligencia artificial con DengueIA. Puntaje: 5.</w:t>
+        <w:t>En lo nacional, con el CONPES 4144 de 2025, la Política Nacional de Inteligencia Artificial, donde la salud es un sector estratégico. También con el Plan Decenal de Salud Pública 2022-2031, en sus ejes de cambio climático y de conocimiento en salud pública.</w:t>
+      </w:r>
+    </w:p>
+    <w:p>
+      <w:pPr>
+        <w:keepNext/>
+        <w:keepLines/>
+      </w:pPr>
+      <w:r>
+        <w:rPr>
+          <w:b w:val="0"/>
+        </w:rPr>
+        <w:t>En lo departamental, con el Plan de Desarrollo «Liderazgo que Transforma», en dos programas concretos: «Valle innovador: distritos de innovación e inteligencia artificial» y «Prevención y promoción en salud». El Plan Territorial de Salud, además, propone usar inteligencia artificial y análisis de datos.</w:t>
+      </w:r>
+    </w:p>
+    <w:p>
+      <w:pPr>
+        <w:keepNext/>
+        <w:keepLines/>
+      </w:pPr>
+      <w:r>
+        <w:rPr>
+          <w:b w:val="0"/>
+        </w:rPr>
+        <w:t>En lo distrital, la planeación en salud de Cali prioriza el dengue y las enfermedades transmitidas por vectores, y la Alcaldía ya usa inteligencia artificial con DengueIA. Puntaje: 5.</w:t>
       </w:r>
     </w:p>
     <w:p>
@@ -430,7 +466,7 @@
         <w:rPr>
           <w:b w:val="0"/>
         </w:rPr>
-        <w:t>3:05–3:45 (40 s) · 78 palabras</w:t>
+        <w:t>5:10–6:20 (70 s) · 149 palabras</w:t>
       </w:r>
     </w:p>
     <w:p>
@@ -442,7 +478,7 @@
         <w:rPr>
           <w:b w:val="0"/>
         </w:rPr>
-        <w:t>Cuarto criterio: apoyo del ecosistema. Propongo una ruta en orden. Primero, Tecnoparque del SENA, gratuito y con una sublínea de inteligencia artificial, para el prototipo. Segundo, NIDO, que acompañó a 220 startups entre 2024 y 2025. Tercero, para validar: la Secretaría de Salud, Icesi, Univalle y el Clúster de Excelencia Clínica.</w:t>
+        <w:t>Cuarto criterio: apoyo del ecosistema. Propongo una ruta en orden.</w:t>
       </w:r>
     </w:p>
     <w:p>
@@ -454,7 +490,43 @@
         <w:rPr>
           <w:b w:val="0"/>
         </w:rPr>
-        <w:t>Para cofinanciar está el Fondo Emprender, pero sus convocatorias de 2026 cerraron en abril. A hoy, 2 de octubre, no hay una convocatoria abierta. Por eso, 4.</w:t>
+        <w:t>Primero, Tecnoparque del SENA: acompañamiento técnico gratuito para construir el prototipo, con una sublínea de inteligencia artificial y geotecnología.</w:t>
+      </w:r>
+    </w:p>
+    <w:p>
+      <w:pPr>
+        <w:keepNext/>
+        <w:keepLines/>
+      </w:pPr>
+      <w:r>
+        <w:rPr>
+          <w:b w:val="0"/>
+        </w:rPr>
+        <w:t>Segundo, NIDO, de la Cámara de Comercio, la Gobernación y la Alcaldía. Acompañó a 220 startups entre 2024 y 2025, su oferta empieza desde la ideación, y en 2024 abrió ValleyCare, una convocatoria para emprendimientos de salud.</w:t>
+      </w:r>
+    </w:p>
+    <w:p>
+      <w:pPr>
+        <w:keepNext/>
+        <w:keepLines/>
+      </w:pPr>
+      <w:r>
+        <w:rPr>
+          <w:b w:val="0"/>
+        </w:rPr>
+        <w:t>Tercero, para validar: la Secretaría de Salud y los equipos de Icesi y Univalle como referencia, y el Clúster de Excelencia Clínica para pilotos con clínicas y EPS.</w:t>
+      </w:r>
+    </w:p>
+    <w:p>
+      <w:pPr>
+        <w:keepNext/>
+        <w:keepLines/>
+      </w:pPr>
+      <w:r>
+        <w:rPr>
+          <w:b w:val="0"/>
+        </w:rPr>
+        <w:t>Para cofinanciar está el Fondo Emprender: en 2026 abrió 12 convocatorias por más de 282.000 millones de pesos, pero cerraron en abril. Podría aplicar en un próximo ciclo, porque acepta estudiantes de los dos últimos semestres. Valle INN, en cambio, encaja poco. A hoy, 2 de octubre, no hay una convocatoria abierta. Por eso, 4.</w:t>
       </w:r>
     </w:p>
     <w:p>
@@ -493,7 +565,7 @@
         <w:rPr>
           <w:b w:val="0"/>
         </w:rPr>
-        <w:t>3:45–4:30 (45 s) · 93 palabras</w:t>
+        <w:t>6:20–7:00 (40 s) · 87 palabras</w:t>
       </w:r>
     </w:p>
     <w:p>
@@ -505,7 +577,7 @@
         <w:rPr>
           <w:b w:val="0"/>
         </w:rPr>
-        <w:t>Este es el resultado principal. AedesAlert Cali obtiene 18 de 20 puntos.</w:t>
+        <w:t>Este es el resultado principal: AedesAlert Cali obtiene 18 de 20 puntos. Califiqué de 1 a 5, donde 5 es cumplir con evidencia verificable y 4 es cumplir, pero con una limitación relevante.</w:t>
       </w:r>
     </w:p>
     <w:p>
@@ -517,7 +589,7 @@
         <w:rPr>
           <w:b w:val="0"/>
         </w:rPr>
-        <w:t>Es fuerte en caracterización económica, con 5, porque transforma el sector salud con capacidades de tecnología. Y en políticas de fomento, con 5, porque está alineada en los tres niveles y Cali ya usa inteligencia artificial contra el dengue. En impacto tiene 4: el problema es grande, pero DengueIA ya probó el enfoque, y mi aporte es que sea abierto y replicable. En ecosistema tiene 4: Tecnoparque y NIDO sirven desde ya, pero la cofinanciación tendrá que esperar un próximo ciclo.</w:t>
+        <w:t>Lo más fuerte es el sector económico y las políticas de fomento, con 5 cada uno. Impacto y ecosistema tienen 4: DengueIA ya probó el enfoque, así que mi aporte es hacerlo abierto y replicable, y hoy no hay una convocatoria de cofinanciación abierta. Ninguno de los cuatro criterios queda por debajo de 4.</w:t>
       </w:r>
     </w:p>
     <w:p>
@@ -556,7 +628,7 @@
         <w:rPr>
           <w:b w:val="0"/>
         </w:rPr>
-        <w:t>4:30–4:50 (20 s) · 41 palabras</w:t>
+        <w:t>7:00–7:40 (40 s) · 88 palabras</w:t>
       </w:r>
     </w:p>
     <w:p>
@@ -568,7 +640,19 @@
         <w:rPr>
           <w:b w:val="0"/>
         </w:rPr>
-        <w:t>En conclusión, la idea pasa la validación regional. El riesgo es que la demanda no está validada y faltan datos por comuna. Mi siguiente paso: conseguir esos datos, ir a Tecnoparque y hablar con una secretaría de salud municipal. Muchas gracias.</w:t>
+        <w:t>En conclusión, la idea pasa la validación regional como complemento abierto de DengueIA. El riesgo principal es este: la demanda en los otros municipios todavía no está validada, y no está confirmado que existan varios años de datos por comuna que incluyan el brote de 2024.</w:t>
+      </w:r>
+    </w:p>
+    <w:p>
+      <w:pPr>
+        <w:keepNext/>
+        <w:keepLines/>
+      </w:pPr>
+      <w:r>
+        <w:rPr>
+          <w:b w:val="0"/>
+        </w:rPr>
+        <w:t>Mis siguientes pasos son tres: revisar qué publica Datos Abiertos Cali y pedir lo que falte con un derecho de petición, presentar el prototipo a Tecnoparque y buscar la opinión de una secretaría de salud municipal en riesgo muy alto. Muchas gracias.</w:t>
       </w:r>
     </w:p>
     <w:p>
@@ -808,7 +892,7 @@
                 <w:color w:val="000000"/>
                 <w:sz w:val="24"/>
               </w:rPr>
-              <w:t>0:00–0:15</w:t>
+              <w:t>0:00–0:20</w:t>
             </w:r>
           </w:p>
         </w:tc>
@@ -826,7 +910,7 @@
                 <w:color w:val="000000"/>
                 <w:sz w:val="24"/>
               </w:rPr>
-              <w:t>15 s</w:t>
+              <w:t>20 s</w:t>
             </w:r>
           </w:p>
         </w:tc>
@@ -844,7 +928,7 @@
                 <w:color w:val="000000"/>
                 <w:sz w:val="24"/>
               </w:rPr>
-              <w:t>34</w:t>
+              <w:t>45</w:t>
             </w:r>
           </w:p>
         </w:tc>
@@ -862,7 +946,7 @@
                 <w:color w:val="000000"/>
                 <w:sz w:val="24"/>
               </w:rPr>
-              <w:t>0:16</w:t>
+              <w:t>0:21</w:t>
             </w:r>
           </w:p>
         </w:tc>
@@ -900,7 +984,7 @@
                 <w:color w:val="000000"/>
                 <w:sz w:val="24"/>
               </w:rPr>
-              <w:t>0:15–0:55</w:t>
+              <w:t>0:20–1:30</w:t>
             </w:r>
           </w:p>
         </w:tc>
@@ -918,7 +1002,7 @@
                 <w:color w:val="000000"/>
                 <w:sz w:val="24"/>
               </w:rPr>
-              <w:t>40 s</w:t>
+              <w:t>70 s</w:t>
             </w:r>
           </w:p>
         </w:tc>
@@ -936,7 +1020,7 @@
                 <w:color w:val="000000"/>
                 <w:sz w:val="24"/>
               </w:rPr>
-              <w:t>91</w:t>
+              <w:t>147</w:t>
             </w:r>
           </w:p>
         </w:tc>
@@ -954,7 +1038,7 @@
                 <w:color w:val="000000"/>
                 <w:sz w:val="24"/>
               </w:rPr>
-              <w:t>0:42</w:t>
+              <w:t>1:08</w:t>
             </w:r>
           </w:p>
         </w:tc>
@@ -992,7 +1076,7 @@
                 <w:color w:val="000000"/>
                 <w:sz w:val="24"/>
               </w:rPr>
-              <w:t>0:55–1:35</w:t>
+              <w:t>1:30–2:45</w:t>
             </w:r>
           </w:p>
         </w:tc>
@@ -1010,7 +1094,7 @@
                 <w:color w:val="000000"/>
                 <w:sz w:val="24"/>
               </w:rPr>
-              <w:t>40 s</w:t>
+              <w:t>75 s</w:t>
             </w:r>
           </w:p>
         </w:tc>
@@ -1028,7 +1112,7 @@
                 <w:color w:val="000000"/>
                 <w:sz w:val="24"/>
               </w:rPr>
-              <w:t>81</w:t>
+              <w:t>166</w:t>
             </w:r>
           </w:p>
         </w:tc>
@@ -1046,7 +1130,7 @@
                 <w:color w:val="000000"/>
                 <w:sz w:val="24"/>
               </w:rPr>
-              <w:t>0:37</w:t>
+              <w:t>1:17</w:t>
             </w:r>
           </w:p>
         </w:tc>
@@ -1084,7 +1168,7 @@
                 <w:color w:val="000000"/>
                 <w:sz w:val="24"/>
               </w:rPr>
-              <w:t>1:35–2:25</w:t>
+              <w:t>2:45–4:10</w:t>
             </w:r>
           </w:p>
         </w:tc>
@@ -1102,7 +1186,7 @@
                 <w:color w:val="000000"/>
                 <w:sz w:val="24"/>
               </w:rPr>
-              <w:t>50 s</w:t>
+              <w:t>85 s</w:t>
             </w:r>
           </w:p>
         </w:tc>
@@ -1120,7 +1204,7 @@
                 <w:color w:val="000000"/>
                 <w:sz w:val="24"/>
               </w:rPr>
-              <w:t>97</w:t>
+              <w:t>175</w:t>
             </w:r>
           </w:p>
         </w:tc>
@@ -1138,7 +1222,7 @@
                 <w:color w:val="000000"/>
                 <w:sz w:val="24"/>
               </w:rPr>
-              <w:t>0:45</w:t>
+              <w:t>1:21</w:t>
             </w:r>
           </w:p>
         </w:tc>
@@ -1176,7 +1260,7 @@
                 <w:color w:val="000000"/>
                 <w:sz w:val="24"/>
               </w:rPr>
-              <w:t>2:25–3:05</w:t>
+              <w:t>4:10–5:10</w:t>
             </w:r>
           </w:p>
         </w:tc>
@@ -1194,7 +1278,7 @@
                 <w:color w:val="000000"/>
                 <w:sz w:val="24"/>
               </w:rPr>
-              <w:t>40 s</w:t>
+              <w:t>60 s</w:t>
             </w:r>
           </w:p>
         </w:tc>
@@ -1212,7 +1296,7 @@
                 <w:color w:val="000000"/>
                 <w:sz w:val="24"/>
               </w:rPr>
-              <w:t>79</w:t>
+              <w:t>130</w:t>
             </w:r>
           </w:p>
         </w:tc>
@@ -1230,7 +1314,7 @@
                 <w:color w:val="000000"/>
                 <w:sz w:val="24"/>
               </w:rPr>
-              <w:t>0:36</w:t>
+              <w:t>1:00</w:t>
             </w:r>
           </w:p>
         </w:tc>
@@ -1268,7 +1352,7 @@
                 <w:color w:val="000000"/>
                 <w:sz w:val="24"/>
               </w:rPr>
-              <w:t>3:05–3:45</w:t>
+              <w:t>5:10–6:20</w:t>
             </w:r>
           </w:p>
         </w:tc>
@@ -1286,7 +1370,7 @@
                 <w:color w:val="000000"/>
                 <w:sz w:val="24"/>
               </w:rPr>
-              <w:t>40 s</w:t>
+              <w:t>70 s</w:t>
             </w:r>
           </w:p>
         </w:tc>
@@ -1304,7 +1388,7 @@
                 <w:color w:val="000000"/>
                 <w:sz w:val="24"/>
               </w:rPr>
-              <w:t>78</w:t>
+              <w:t>149</w:t>
             </w:r>
           </w:p>
         </w:tc>
@@ -1322,7 +1406,7 @@
                 <w:color w:val="000000"/>
                 <w:sz w:val="24"/>
               </w:rPr>
-              <w:t>0:36</w:t>
+              <w:t>1:09</w:t>
             </w:r>
           </w:p>
         </w:tc>
@@ -1360,7 +1444,7 @@
                 <w:color w:val="000000"/>
                 <w:sz w:val="24"/>
               </w:rPr>
-              <w:t>3:45–4:30</w:t>
+              <w:t>6:20–7:00</w:t>
             </w:r>
           </w:p>
         </w:tc>
@@ -1378,7 +1462,7 @@
                 <w:color w:val="000000"/>
                 <w:sz w:val="24"/>
               </w:rPr>
-              <w:t>45 s</w:t>
+              <w:t>40 s</w:t>
             </w:r>
           </w:p>
         </w:tc>
@@ -1396,7 +1480,7 @@
                 <w:color w:val="000000"/>
                 <w:sz w:val="24"/>
               </w:rPr>
-              <w:t>93</w:t>
+              <w:t>87</w:t>
             </w:r>
           </w:p>
         </w:tc>
@@ -1414,7 +1498,7 @@
                 <w:color w:val="000000"/>
                 <w:sz w:val="24"/>
               </w:rPr>
-              <w:t>0:43</w:t>
+              <w:t>0:40</w:t>
             </w:r>
           </w:p>
         </w:tc>
@@ -1452,7 +1536,7 @@
                 <w:color w:val="000000"/>
                 <w:sz w:val="24"/>
               </w:rPr>
-              <w:t>4:30–4:50</w:t>
+              <w:t>7:00–7:40</w:t>
             </w:r>
           </w:p>
         </w:tc>
@@ -1470,7 +1554,7 @@
                 <w:color w:val="000000"/>
                 <w:sz w:val="24"/>
               </w:rPr>
-              <w:t>20 s</w:t>
+              <w:t>40 s</w:t>
             </w:r>
           </w:p>
         </w:tc>
@@ -1488,7 +1572,7 @@
                 <w:color w:val="000000"/>
                 <w:sz w:val="24"/>
               </w:rPr>
-              <w:t>41</w:t>
+              <w:t>88</w:t>
             </w:r>
           </w:p>
         </w:tc>
@@ -1506,7 +1590,7 @@
                 <w:color w:val="000000"/>
                 <w:sz w:val="24"/>
               </w:rPr>
-              <w:t>0:19</w:t>
+              <w:t>0:41</w:t>
             </w:r>
           </w:p>
         </w:tc>
@@ -1560,7 +1644,7 @@
                 <w:color w:val="000000"/>
                 <w:sz w:val="24"/>
               </w:rPr>
-              <w:t>0:00–4:50</w:t>
+              <w:t>0:00–7:40</w:t>
             </w:r>
           </w:p>
         </w:tc>
@@ -1586,7 +1670,7 @@
                 <w:color w:val="000000"/>
                 <w:sz w:val="24"/>
               </w:rPr>
-              <w:t>290 s</w:t>
+              <w:t>460 s</w:t>
             </w:r>
           </w:p>
         </w:tc>
@@ -1612,7 +1696,7 @@
                 <w:color w:val="000000"/>
                 <w:sz w:val="24"/>
               </w:rPr>
-              <w:t>594</w:t>
+              <w:t>987</w:t>
             </w:r>
           </w:p>
         </w:tc>
@@ -1638,7 +1722,7 @@
                 <w:color w:val="000000"/>
                 <w:sz w:val="24"/>
               </w:rPr>
-              <w:t>4:34</w:t>
+              <w:t>7:36</w:t>
             </w:r>
           </w:p>
         </w:tc>
@@ -1650,7 +1734,7 @@
         <w:rPr>
           <w:b w:val="0"/>
         </w:rPr>
-        <w:t>El guion tiene 594 palabras. A 130 palabras por minuto dura unos 4:34 minutos, dentro del rango de 4:30 a 5:00 y cerca de los 4:50 de la escaleta. Al decir las cifras en voz alta (por ejemplo, «2024» son tres palabras y «93 %», cuatro), el texto equivale a unas 647 palabras, es decir, unos 4:59 minutos. Si en el ensayo con cronómetro se pasa de 5:00, lo primero que se puede recortar es la frase del empleo en tecnología (diapositiva 3) y la del costo del dengue (diapositiva 4), porque esas cifras ya están en pantalla.</w:t>
+        <w:t>El guion tiene 987 palabras. A 130 palabras por minuto dura unos 7:36 minutos, cerca de los 7:40 de la escaleta. Al decir las cifras en voz alta (por ejemplo, «2024» son tres palabras y «93 %», cuatro), el texto equivale a unas 1046 palabras, es decir, unos 8:03 minutos. Si en el ensayo con cronómetro se pasa de 8:00, lo primero que se puede recortar es la frase del empleo en tecnología (diapositiva 3), la de los estudios técnicos (diapositiva 4) y la de ValleyCare (diapositiva 6), porque esas cifras ya están en pantalla.</w:t>
       </w:r>
     </w:p>
     <w:p>

</xml_diff>